<commit_message>
[mp006] docs: refresh owner xlsx+docx with 2026-05-10 status
- Add 3 new owner-visible items: cross-route data parity check,
  product-line dashboard view (34-col Excel lift), shipping label
  status with reference photos
- Refresh narrative with staging-operational + first end-to-end
  green milestone (12/12 demo orders complete roundtrip)
- Extend xlsx schema with column J "JIRA" for upcoming back-linked
  issue keys (loaded from sidecar jira_keys.json)
- Catalog count: 97 -> 100 work items
</commit_message>
<xml_diff>
--- a/specs/006-master-plan/deliverables/SRS_He_Thong_Quan_Ly_Don_Hang_VN.docx
+++ b/specs/006-master-plan/deliverables/SRS_He_Thong_Quan_Ly_Don_Hang_VN.docx
@@ -832,6 +832,26 @@
     </w:tbl>
     <w:p>
       <w:pPr>
+        <w:pStyle w:val="Heading2"/>
+      </w:pPr>
+      <w:r>
+        <w:rPr>
+          <w:rFonts w:ascii="Calibri" w:hAnsi="Calibri"/>
+        </w:rPr>
+        <w:t>3.1 Tình trạng triển khai hiện tại</w:t>
+      </w:r>
+    </w:p>
+    <w:p>
+      <w:r>
+        <w:rPr>
+          <w:rFonts w:ascii="Calibri" w:hAnsi="Calibri"/>
+          <w:sz w:val="22"/>
+        </w:rPr>
+        <w:t>Môi trường demo đã chạy ổn định trên máy chủ riêng và hoàn tất một lượt vòng đời đơn hàng đầu tiên: kéo đơn từ Etsy về, gửi file thiết kế lên Google Drive, đẩy đơn cho Gearment, nhận webhook trạng thái, nhập tracking, đánh dấu đã giao và đồng bộ về Etsy. 12/12 đơn mẫu của đợt thử nghiệm đầu tiên đạt kết quả đúng. Đây là cơ sở để bước tiếp sang giai đoạn cấu hình cho dữ liệu thực.</w:t>
+      </w:r>
+    </w:p>
+    <w:p>
+      <w:pPr>
         <w:pStyle w:val="Heading1"/>
       </w:pPr>
       <w:r>
@@ -1067,6 +1087,26 @@
           <w:sz w:val="22"/>
         </w:rPr>
         <w:t>Sau 3 lần lỗi liên tiếp, hệ thống tự chuyển sang đường dự phòng và gửi cảnh báo cho admin; mọi thay đổi được lưu lại. Khi đường chính ổn định trở lại (6 lần thành công liên tiếp), hệ thống tự quay về đường chính. Admin có thể khoá việc tự quay về.</w:t>
+      </w:r>
+    </w:p>
+    <w:p>
+      <w:pPr>
+        <w:pStyle w:val="Heading2"/>
+      </w:pPr>
+      <w:r>
+        <w:rPr>
+          <w:rFonts w:ascii="Calibri" w:hAnsi="Calibri"/>
+        </w:rPr>
+        <w:t>4.4 Đối chiếu giữa hai đường</w:t>
+      </w:r>
+    </w:p>
+    <w:p>
+      <w:r>
+        <w:rPr>
+          <w:rFonts w:ascii="Calibri" w:hAnsi="Calibri"/>
+          <w:sz w:val="22"/>
+        </w:rPr>
+        <w:t>Sau mỗi đợt đồng bộ, hệ thống tự so sánh đơn lấy từ kết nối Etsy chính thức với đơn lấy từ email dự phòng. Mọi sai lệch về số đơn, sản phẩm, giá, người nhận và phí vận chuyển được liệt kê trên một trang riêng để BA xử lý trước khi đóng đợt. Đợt thử nghiệm đầu tiên trên môi trường demo đạt 12/12 đơn khớp tuyệt đối.</w:t>
       </w:r>
     </w:p>
     <w:p>
@@ -1356,6 +1396,15 @@
       </w:r>
     </w:p>
     <w:p>
+      <w:r>
+        <w:rPr>
+          <w:rFonts w:ascii="Calibri" w:hAnsi="Calibri"/>
+          <w:sz w:val="22"/>
+        </w:rPr>
+        <w:t>• Chế độ xem theo dòng sản phẩm: hiển thị 34 cột thông tin Marketing đang dùng trên Excel (mã đơn, ảnh, chú thích cá nhân hoá, kích thước, số lượng, ngày hứa giao, người phụ trách, ...) — sửa, lọc, sắp xếp đều ở mức từng sản phẩm.</w:t>
+      </w:r>
+    </w:p>
+    <w:p>
       <w:pPr>
         <w:pStyle w:val="Heading1"/>
       </w:pPr>
@@ -1427,6 +1476,15 @@
           <w:sz w:val="22"/>
         </w:rPr>
         <w:t>• Hiển thị tình trạng tracking thực tế (in-transit, delivered, returned) — bật ở giai đoạn 2.</w:t>
+      </w:r>
+    </w:p>
+    <w:p>
+      <w:r>
+        <w:rPr>
+          <w:rFonts w:ascii="Calibri" w:hAnsi="Calibri"/>
+          <w:sz w:val="22"/>
+        </w:rPr>
+        <w:t>• Trạng thái nhãn vận chuyển có ảnh minh hoạ: khi BA chọn trạng thái, danh sách tuỳ chọn hiển thị kèm ảnh thực tế của nhãn — giúp nhận diện nhanh và giảm sai sót. Admin có thể thêm/sửa trạng thái và ảnh trong phần Cài đặt.</w:t>
       </w:r>
     </w:p>
     <w:p>
@@ -2931,7 +2989,7 @@
           </w:tcPr>
           <w:p>
             <w:r>
-              <w:t>Xuất Excel tin nhắn khách theo khoảng thời gian</w:t>
+              <w:t>Đối chiếu dữ liệu giữa đường chính và đường dự phòng</w:t>
             </w:r>
           </w:p>
         </w:tc>
@@ -2942,7 +3000,7 @@
           </w:tcPr>
           <w:p>
             <w:r>
-              <w:t>Giai đoạn 2</w:t>
+              <w:t>Giai đoạn 1</w:t>
             </w:r>
           </w:p>
         </w:tc>
@@ -2977,7 +3035,7 @@
           </w:tcPr>
           <w:p>
             <w:r>
-              <w:t>Nhập 17.659 đơn hàng cũ từ file Excel</w:t>
+              <w:t>Xuất Excel tin nhắn khách theo khoảng thời gian</w:t>
             </w:r>
           </w:p>
         </w:tc>
@@ -2988,7 +3046,7 @@
           </w:tcPr>
           <w:p>
             <w:r>
-              <w:t>Giai đoạn 1</w:t>
+              <w:t>Giai đoạn 2</w:t>
             </w:r>
           </w:p>
         </w:tc>
@@ -3023,7 +3081,7 @@
           </w:tcPr>
           <w:p>
             <w:r>
-              <w:t>Sửa 423 đơn ghi giá 0 USD</w:t>
+              <w:t>Nhập 17.659 đơn hàng cũ từ file Excel</w:t>
             </w:r>
           </w:p>
         </w:tc>
@@ -3069,7 +3127,7 @@
           </w:tcPr>
           <w:p>
             <w:r>
-              <w:t>Nhận đúng tiền tệ USD/EUR/GBP/CAD/VND</w:t>
+              <w:t>Sửa 423 đơn ghi giá 0 USD</w:t>
             </w:r>
           </w:p>
         </w:tc>
@@ -3115,7 +3173,7 @@
           </w:tcPr>
           <w:p>
             <w:r>
-              <w:t>Tách phí ship thành dòng riêng</w:t>
+              <w:t>Nhận đúng tiền tệ USD/EUR/GBP/CAD/VND</w:t>
             </w:r>
           </w:p>
         </w:tc>
@@ -3161,7 +3219,7 @@
           </w:tcPr>
           <w:p>
             <w:r>
-              <w:t>Gộp khách hàng trùng có BA duyệt</w:t>
+              <w:t>Tách phí ship thành dòng riêng</w:t>
             </w:r>
           </w:p>
         </w:tc>
@@ -3207,7 +3265,7 @@
           </w:tcPr>
           <w:p>
             <w:r>
-              <w:t>Báo cáo đối chiếu sau khi làm sạch dữ liệu</w:t>
+              <w:t>Gộp khách hàng trùng có BA duyệt</w:t>
             </w:r>
           </w:p>
         </w:tc>
@@ -3253,7 +3311,7 @@
           </w:tcPr>
           <w:p>
             <w:r>
-              <w:t>Đặt đơn cũ ở trạng thái 'đã hoàn tất'</w:t>
+              <w:t>Báo cáo đối chiếu sau khi làm sạch dữ liệu</w:t>
             </w:r>
           </w:p>
         </w:tc>
@@ -3299,7 +3357,7 @@
           </w:tcPr>
           <w:p>
             <w:r>
-              <w:t>Hiển thị 10 cột chính</w:t>
+              <w:t>Đặt đơn cũ ở trạng thái 'đã hoàn tất'</w:t>
             </w:r>
           </w:p>
         </w:tc>
@@ -3345,7 +3403,7 @@
           </w:tcPr>
           <w:p>
             <w:r>
-              <w:t>Cửa hàng và Mã đơn ở 2 cột đầu, có ô tìm kiếm</w:t>
+              <w:t>Hiển thị 10 cột chính</w:t>
             </w:r>
           </w:p>
         </w:tc>
@@ -3391,7 +3449,7 @@
           </w:tcPr>
           <w:p>
             <w:r>
-              <w:t>Bỏ các cột không cần thiết</w:t>
+              <w:t>Cửa hàng và Mã đơn ở 2 cột đầu, có ô tìm kiếm</w:t>
             </w:r>
           </w:p>
         </w:tc>
@@ -3437,7 +3495,7 @@
           </w:tcPr>
           <w:p>
             <w:r>
-              <w:t>Gộp Tracking + tình trạng nhãn + carrier vào 1 cột</w:t>
+              <w:t>Bỏ các cột không cần thiết</w:t>
             </w:r>
           </w:p>
         </w:tc>
@@ -3483,7 +3541,7 @@
           </w:tcPr>
           <w:p>
             <w:r>
-              <w:t>Ảnh sản phẩm trên mỗi đơn</w:t>
+              <w:t>Gộp Tracking + tình trạng nhãn + carrier vào 1 cột</w:t>
             </w:r>
           </w:p>
         </w:tc>
@@ -3529,7 +3587,7 @@
           </w:tcPr>
           <w:p>
             <w:r>
-              <w:t>Chỉnh trực tiếp các cột thao tác</w:t>
+              <w:t>Ảnh sản phẩm trên mỗi đơn</w:t>
             </w:r>
           </w:p>
         </w:tc>
@@ -3575,7 +3633,7 @@
           </w:tcPr>
           <w:p>
             <w:r>
-              <w:t>Tô màu hàng theo loại đơn</w:t>
+              <w:t>Chỉnh trực tiếp các cột thao tác</w:t>
             </w:r>
           </w:p>
         </w:tc>
@@ -3621,7 +3679,7 @@
           </w:tcPr>
           <w:p>
             <w:r>
-              <w:t>Nút Push đánh dấu đơn ưu tiên</w:t>
+              <w:t>Tô màu hàng theo loại đơn</w:t>
             </w:r>
           </w:p>
         </w:tc>
@@ -3667,7 +3725,7 @@
           </w:tcPr>
           <w:p>
             <w:r>
-              <w:t>Cảnh báo đơn quá 2 ngày chưa duyệt file</w:t>
+              <w:t>Nút Push đánh dấu đơn ưu tiên</w:t>
             </w:r>
           </w:p>
         </w:tc>
@@ -3713,7 +3771,7 @@
           </w:tcPr>
           <w:p>
             <w:r>
-              <w:t>Cột hạn ship</w:t>
+              <w:t>Cảnh báo đơn quá 2 ngày chưa duyệt file</w:t>
             </w:r>
           </w:p>
         </w:tc>
@@ -3759,7 +3817,7 @@
           </w:tcPr>
           <w:p>
             <w:r>
-              <w:t>Avatar người quản lý cửa hàng</w:t>
+              <w:t>Cột hạn ship</w:t>
             </w:r>
           </w:p>
         </w:tc>
@@ -3805,7 +3863,7 @@
           </w:tcPr>
           <w:p>
             <w:r>
-              <w:t>Popup thông báo các sự kiện đặc biệt</w:t>
+              <w:t>Avatar người quản lý cửa hàng</w:t>
             </w:r>
           </w:p>
         </w:tc>
@@ -3851,7 +3909,7 @@
           </w:tcPr>
           <w:p>
             <w:r>
-              <w:t>Trường 'Ghi chú Marketing' trên đơn</w:t>
+              <w:t>Popup thông báo các sự kiện đặc biệt</w:t>
             </w:r>
           </w:p>
         </w:tc>
@@ -3897,7 +3955,7 @@
           </w:tcPr>
           <w:p>
             <w:r>
-              <w:t>Lịch sử thay đổi trạng thái đơn</w:t>
+              <w:t>Trường 'Ghi chú Marketing' trên đơn</w:t>
             </w:r>
           </w:p>
         </w:tc>
@@ -3943,7 +4001,7 @@
           </w:tcPr>
           <w:p>
             <w:r>
-              <w:t>BA tự phân loại lại sản phẩm</w:t>
+              <w:t>Lịch sử thay đổi trạng thái đơn</w:t>
             </w:r>
           </w:p>
         </w:tc>
@@ -3989,7 +4047,7 @@
           </w:tcPr>
           <w:p>
             <w:r>
-              <w:t>Nhãn trạng thái file thiết kế trên mỗi dòng đơn</w:t>
+              <w:t>BA tự phân loại lại sản phẩm</w:t>
             </w:r>
           </w:p>
         </w:tc>
@@ -4035,7 +4093,7 @@
           </w:tcPr>
           <w:p>
             <w:r>
-              <w:t>Trang Tracking riêng (không phải bộ lọc Đơn hàng)</w:t>
+              <w:t>Nhãn trạng thái file thiết kế trên mỗi dòng đơn</w:t>
             </w:r>
           </w:p>
         </w:tc>
@@ -4081,7 +4139,7 @@
           </w:tcPr>
           <w:p>
             <w:r>
-              <w:t>13 cột phục vụ vận chuyển</w:t>
+              <w:t>Bảng điều khiển dạng dòng sản phẩm (theo từng sản phẩm trong đơn)</w:t>
             </w:r>
           </w:p>
         </w:tc>
@@ -4127,7 +4185,7 @@
           </w:tcPr>
           <w:p>
             <w:r>
-              <w:t>Xuất Excel theo bộ lọc đang xem</w:t>
+              <w:t>Trang Tracking riêng (không phải bộ lọc Đơn hàng)</w:t>
             </w:r>
           </w:p>
         </w:tc>
@@ -4173,7 +4231,7 @@
           </w:tcPr>
           <w:p>
             <w:r>
-              <w:t>Đổi trạng thái nhãn hàng loạt</w:t>
+              <w:t>13 cột phục vụ vận chuyển</w:t>
             </w:r>
           </w:p>
         </w:tc>
@@ -4219,7 +4277,7 @@
           </w:tcPr>
           <w:p>
             <w:r>
-              <w:t>Ô tìm kiếm nhanh</w:t>
+              <w:t>Xuất Excel theo bộ lọc đang xem</w:t>
             </w:r>
           </w:p>
         </w:tc>
@@ -4265,7 +4323,7 @@
           </w:tcPr>
           <w:p>
             <w:r>
-              <w:t>Đồng bộ thay đổi sang Bảng điều khiển Đơn hàng</w:t>
+              <w:t>Đổi trạng thái nhãn hàng loạt</w:t>
             </w:r>
           </w:p>
         </w:tc>
@@ -4311,7 +4369,7 @@
           </w:tcPr>
           <w:p>
             <w:r>
-              <w:t>Khoá thao tác mua nhãn khi đang chờ duyệt đổi địa chỉ</w:t>
+              <w:t>Ô tìm kiếm nhanh</w:t>
             </w:r>
           </w:p>
         </w:tc>
@@ -4357,7 +4415,7 @@
           </w:tcPr>
           <w:p>
             <w:r>
-              <w:t>Hiển thị tình trạng tracking thực tế (in-transit, delivered, returned)</w:t>
+              <w:t>Đồng bộ thay đổi sang Bảng điều khiển Đơn hàng</w:t>
             </w:r>
           </w:p>
         </w:tc>
@@ -4368,7 +4426,7 @@
           </w:tcPr>
           <w:p>
             <w:r>
-              <w:t>Giai đoạn 2</w:t>
+              <w:t>Giai đoạn 1</w:t>
             </w:r>
           </w:p>
         </w:tc>
@@ -4403,7 +4461,7 @@
           </w:tcPr>
           <w:p>
             <w:r>
-              <w:t>Đặt tên 'Bảng điều khiển Sản xuất'</w:t>
+              <w:t>Khoá thao tác mua nhãn khi đang chờ duyệt đổi địa chỉ</w:t>
             </w:r>
           </w:p>
         </w:tc>
@@ -4449,7 +4507,7 @@
           </w:tcPr>
           <w:p>
             <w:r>
-              <w:t>Bộ cột phục vụ sản xuất</w:t>
+              <w:t>Hiển thị tình trạng tracking thực tế (in-transit, delivered, returned)</w:t>
             </w:r>
           </w:p>
         </w:tc>
@@ -4460,7 +4518,7 @@
           </w:tcPr>
           <w:p>
             <w:r>
-              <w:t>Giai đoạn 1</w:t>
+              <w:t>Giai đoạn 2</w:t>
             </w:r>
           </w:p>
         </w:tc>
@@ -4495,7 +4553,7 @@
           </w:tcPr>
           <w:p>
             <w:r>
-              <w:t>Toàn bộ phòng ban xem trên CÙNG MỘT MÀN HÌNH</w:t>
+              <w:t>Trạng thái nhãn vận chuyển có ảnh minh hoạ</w:t>
             </w:r>
           </w:p>
         </w:tc>
@@ -4541,7 +4599,7 @@
           </w:tcPr>
           <w:p>
             <w:r>
-              <w:t>Cột pipeline-state (giai đoạn sản xuất hiện tại)</w:t>
+              <w:t>Đặt tên 'Bảng điều khiển Sản xuất'</w:t>
             </w:r>
           </w:p>
         </w:tc>
@@ -4587,7 +4645,7 @@
           </w:tcPr>
           <w:p>
             <w:r>
-              <w:t>Gán nhóm phụ trách cho từng giai đoạn</w:t>
+              <w:t>Bộ cột phục vụ sản xuất</w:t>
             </w:r>
           </w:p>
         </w:tc>
@@ -4633,7 +4691,7 @@
           </w:tcPr>
           <w:p>
             <w:r>
-              <w:t>Hiển thị ảnh thiết kế và bản preview</w:t>
+              <w:t>Toàn bộ phòng ban xem trên CÙNG MỘT MÀN HÌNH</w:t>
             </w:r>
           </w:p>
         </w:tc>
@@ -4679,7 +4737,7 @@
           </w:tcPr>
           <w:p>
             <w:r>
-              <w:t>Widget thống kê đơn</w:t>
+              <w:t>Cột pipeline-state (giai đoạn sản xuất hiện tại)</w:t>
             </w:r>
           </w:p>
         </w:tc>
@@ -4725,7 +4783,7 @@
           </w:tcPr>
           <w:p>
             <w:r>
-              <w:t>Scan barcode để chốt đơn hoàn thành</w:t>
+              <w:t>Gán nhóm phụ trách cho từng giai đoạn</w:t>
             </w:r>
           </w:p>
         </w:tc>
@@ -4771,7 +4829,7 @@
           </w:tcPr>
           <w:p>
             <w:r>
-              <w:t>Lịch sử các thay đổi giai đoạn sản xuất</w:t>
+              <w:t>Hiển thị ảnh thiết kế và bản preview</w:t>
             </w:r>
           </w:p>
         </w:tc>
@@ -4817,7 +4875,7 @@
           </w:tcPr>
           <w:p>
             <w:r>
-              <w:t>Cho phép upload lại file thiết kế kích thước lớn</w:t>
+              <w:t>Widget thống kê đơn</w:t>
             </w:r>
           </w:p>
         </w:tc>
@@ -4863,7 +4921,7 @@
           </w:tcPr>
           <w:p>
             <w:r>
-              <w:t>Quy trình duyệt file thiết kế</w:t>
+              <w:t>Scan barcode để chốt đơn hoàn thành</w:t>
             </w:r>
           </w:p>
         </w:tc>
@@ -4909,7 +4967,7 @@
           </w:tcPr>
           <w:p>
             <w:r>
-              <w:t>Hàng đợi thiết kế dạng kanban 3 cột</w:t>
+              <w:t>Lịch sử các thay đổi giai đoạn sản xuất</w:t>
             </w:r>
           </w:p>
         </w:tc>
@@ -4955,7 +5013,7 @@
           </w:tcPr>
           <w:p>
             <w:r>
-              <w:t>Quy trình duyệt đổi địa chỉ giao hàng</w:t>
+              <w:t>Cho phép upload lại file thiết kế kích thước lớn</w:t>
             </w:r>
           </w:p>
         </w:tc>
@@ -5001,7 +5059,7 @@
           </w:tcPr>
           <w:p>
             <w:r>
-              <w:t>Khoá mua nhãn khi đang chờ duyệt đổi địa chỉ</w:t>
+              <w:t>Quy trình duyệt file thiết kế</w:t>
             </w:r>
           </w:p>
         </w:tc>
@@ -5047,7 +5105,7 @@
           </w:tcPr>
           <w:p>
             <w:r>
-              <w:t>Tạo ticket đổi/hoàn tiền từ trang chi tiết đơn</w:t>
+              <w:t>Hàng đợi thiết kế dạng kanban 3 cột</w:t>
             </w:r>
           </w:p>
         </w:tc>
@@ -5058,7 +5116,7 @@
           </w:tcPr>
           <w:p>
             <w:r>
-              <w:t>Giai đoạn 2</w:t>
+              <w:t>Giai đoạn 1</w:t>
             </w:r>
           </w:p>
         </w:tc>
@@ -5093,7 +5151,7 @@
           </w:tcPr>
           <w:p>
             <w:r>
-              <w:t>BA duyệt ticket → hệ thống tự xử lý</w:t>
+              <w:t>Quy trình duyệt đổi địa chỉ giao hàng</w:t>
             </w:r>
           </w:p>
         </w:tc>
@@ -5104,7 +5162,7 @@
           </w:tcPr>
           <w:p>
             <w:r>
-              <w:t>Giai đoạn 2</w:t>
+              <w:t>Giai đoạn 1</w:t>
             </w:r>
           </w:p>
         </w:tc>
@@ -5139,7 +5197,7 @@
           </w:tcPr>
           <w:p>
             <w:r>
-              <w:t>Lịch sử ticket trên trang đơn</w:t>
+              <w:t>Khoá mua nhãn khi đang chờ duyệt đổi địa chỉ</w:t>
             </w:r>
           </w:p>
         </w:tc>
@@ -5150,7 +5208,7 @@
           </w:tcPr>
           <w:p>
             <w:r>
-              <w:t>Giai đoạn 2</w:t>
+              <w:t>Giai đoạn 1</w:t>
             </w:r>
           </w:p>
         </w:tc>
@@ -5185,7 +5243,7 @@
           </w:tcPr>
           <w:p>
             <w:r>
-              <w:t>Nhập tracking từ file Excel logistics (GKE)</w:t>
+              <w:t>Tạo ticket đổi/hoàn tiền từ trang chi tiết đơn</w:t>
             </w:r>
           </w:p>
         </w:tc>
@@ -5196,7 +5254,7 @@
           </w:tcPr>
           <w:p>
             <w:r>
-              <w:t>Giai đoạn 1</w:t>
+              <w:t>Giai đoạn 2</w:t>
             </w:r>
           </w:p>
         </w:tc>
@@ -5231,7 +5289,7 @@
           </w:tcPr>
           <w:p>
             <w:r>
-              <w:t>Tự nhận diện carrier từ số tracking</w:t>
+              <w:t>BA duyệt ticket → hệ thống tự xử lý</w:t>
             </w:r>
           </w:p>
         </w:tc>
@@ -5242,7 +5300,7 @@
           </w:tcPr>
           <w:p>
             <w:r>
-              <w:t>Giai đoạn 1</w:t>
+              <w:t>Giai đoạn 2</w:t>
             </w:r>
           </w:p>
         </w:tc>
@@ -5277,7 +5335,7 @@
           </w:tcPr>
           <w:p>
             <w:r>
-              <w:t>Xử lý đơn '-replace' và lưu URL nhãn / mã QR</w:t>
+              <w:t>Lịch sử ticket trên trang đơn</w:t>
             </w:r>
           </w:p>
         </w:tc>
@@ -5288,7 +5346,7 @@
           </w:tcPr>
           <w:p>
             <w:r>
-              <w:t>Giai đoạn 1</w:t>
+              <w:t>Giai đoạn 2</w:t>
             </w:r>
           </w:p>
         </w:tc>
@@ -5323,7 +5381,7 @@
           </w:tcPr>
           <w:p>
             <w:r>
-              <w:t>Báo cáo nhập tracking (đã khớp / chưa khớp)</w:t>
+              <w:t>Nhập tracking từ file Excel logistics (GKE)</w:t>
             </w:r>
           </w:p>
         </w:tc>
@@ -5369,7 +5427,7 @@
           </w:tcPr>
           <w:p>
             <w:r>
-              <w:t>Kết nối Gearment và đẩy đơn</w:t>
+              <w:t>Tự nhận diện carrier từ số tracking</w:t>
             </w:r>
           </w:p>
         </w:tc>
@@ -5380,7 +5438,7 @@
           </w:tcPr>
           <w:p>
             <w:r>
-              <w:t>Giai đoạn 2</w:t>
+              <w:t>Giai đoạn 1</w:t>
             </w:r>
           </w:p>
         </w:tc>
@@ -5415,7 +5473,7 @@
           </w:tcPr>
           <w:p>
             <w:r>
-              <w:t>Quy trình Gearment 4 bước</w:t>
+              <w:t>Xử lý đơn '-replace' và lưu URL nhãn / mã QR</w:t>
             </w:r>
           </w:p>
         </w:tc>
@@ -5426,7 +5484,7 @@
           </w:tcPr>
           <w:p>
             <w:r>
-              <w:t>Giai đoạn 2</w:t>
+              <w:t>Giai đoạn 1</w:t>
             </w:r>
           </w:p>
         </w:tc>
@@ -5461,7 +5519,7 @@
           </w:tcPr>
           <w:p>
             <w:r>
-              <w:t>Nhận tracking và tình trạng từ Gearment</w:t>
+              <w:t>Báo cáo nhập tracking (đã khớp / chưa khớp)</w:t>
             </w:r>
           </w:p>
         </w:tc>
@@ -5472,7 +5530,7 @@
           </w:tcPr>
           <w:p>
             <w:r>
-              <w:t>Giai đoạn 2</w:t>
+              <w:t>Giai đoạn 1</w:t>
             </w:r>
           </w:p>
         </w:tc>
@@ -5507,7 +5565,7 @@
           </w:tcPr>
           <w:p>
             <w:r>
-              <w:t>Xử lý lỗi và thử lại tự động</w:t>
+              <w:t>Kết nối Gearment và đẩy đơn</w:t>
             </w:r>
           </w:p>
         </w:tc>
@@ -5553,7 +5611,7 @@
           </w:tcPr>
           <w:p>
             <w:r>
-              <w:t>Chính sách huỷ đơn nháp ở Gearment khi rework</w:t>
+              <w:t>Quy trình Gearment 4 bước</w:t>
             </w:r>
           </w:p>
         </w:tc>
@@ -5599,7 +5657,7 @@
           </w:tcPr>
           <w:p>
             <w:r>
-              <w:t>Một lần upload — gửi đến nhiều nơi</w:t>
+              <w:t>Nhận tracking và tình trạng từ Gearment</w:t>
             </w:r>
           </w:p>
         </w:tc>
@@ -5610,7 +5668,7 @@
           </w:tcPr>
           <w:p>
             <w:r>
-              <w:t>Giai đoạn 1</w:t>
+              <w:t>Giai đoạn 2</w:t>
             </w:r>
           </w:p>
         </w:tc>
@@ -5645,7 +5703,7 @@
           </w:tcPr>
           <w:p>
             <w:r>
-              <w:t>Theo dõi tình trạng nhận file của từng nơi</w:t>
+              <w:t>Xử lý lỗi và thử lại tự động</w:t>
             </w:r>
           </w:p>
         </w:tc>
@@ -5656,7 +5714,7 @@
           </w:tcPr>
           <w:p>
             <w:r>
-              <w:t>Giai đoạn 1</w:t>
+              <w:t>Giai đoạn 2</w:t>
             </w:r>
           </w:p>
         </w:tc>
@@ -5691,7 +5749,7 @@
           </w:tcPr>
           <w:p>
             <w:r>
-              <w:t>Wizard tải hàng loạt file đã duyệt theo khổ A4</w:t>
+              <w:t>Chính sách huỷ đơn nháp ở Gearment khi rework</w:t>
             </w:r>
           </w:p>
         </w:tc>
@@ -5702,7 +5760,7 @@
           </w:tcPr>
           <w:p>
             <w:r>
-              <w:t>Giai đoạn 1</w:t>
+              <w:t>Giai đoạn 2</w:t>
             </w:r>
           </w:p>
         </w:tc>
@@ -5737,7 +5795,7 @@
           </w:tcPr>
           <w:p>
             <w:r>
-              <w:t>Lưu trữ chính trên Google Drive, có hàng đợi an toàn khi lỗi</w:t>
+              <w:t>Một lần upload — gửi đến nhiều nơi</w:t>
             </w:r>
           </w:p>
         </w:tc>
@@ -5783,7 +5841,7 @@
           </w:tcPr>
           <w:p>
             <w:r>
-              <w:t>Upload lại sau khi 'Cần chỉnh sửa' tạo bản version mới</w:t>
+              <w:t>Theo dõi tình trạng nhận file của từng nơi</w:t>
             </w:r>
           </w:p>
         </w:tc>
@@ -5829,7 +5887,7 @@
           </w:tcPr>
           <w:p>
             <w:r>
-              <w:t>Cảnh báo khi 'gửi file' bị treo &gt; 2 giờ</w:t>
+              <w:t>Wizard tải hàng loạt file đã duyệt theo khổ A4</w:t>
             </w:r>
           </w:p>
         </w:tc>
@@ -5875,7 +5933,7 @@
           </w:tcPr>
           <w:p>
             <w:r>
-              <w:t>Tự động gửi file thiết kế khi BA xác nhận đơn</w:t>
+              <w:t>Lưu trữ chính trên Google Drive, có hàng đợi an toàn khi lỗi</w:t>
             </w:r>
           </w:p>
         </w:tc>
@@ -5921,7 +5979,7 @@
           </w:tcPr>
           <w:p>
             <w:r>
-              <w:t>Pipeline có thể tự định nghĩa (không cần lập trình)</w:t>
+              <w:t>Upload lại sau khi 'Cần chỉnh sửa' tạo bản version mới</w:t>
             </w:r>
           </w:p>
         </w:tc>
@@ -5967,7 +6025,7 @@
           </w:tcPr>
           <w:p>
             <w:r>
-              <w:t>Mỗi sản phẩm/danh mục dùng pipeline phù hợp</w:t>
+              <w:t>Cảnh báo khi 'gửi file' bị treo &gt; 2 giờ</w:t>
             </w:r>
           </w:p>
         </w:tc>
@@ -6013,7 +6071,7 @@
           </w:tcPr>
           <w:p>
             <w:r>
-              <w:t>Đơn có nhiều sản phẩm khác pipeline — BA chọn pipeline</w:t>
+              <w:t>Tự động gửi file thiết kế khi BA xác nhận đơn</w:t>
             </w:r>
           </w:p>
         </w:tc>
@@ -6059,7 +6117,7 @@
           </w:tcPr>
           <w:p>
             <w:r>
-              <w:t>Tự sao lưu phiên bản pipeline khi sửa lúc đang có đơn chạy</w:t>
+              <w:t>Pipeline có thể tự định nghĩa (không cần lập trình)</w:t>
             </w:r>
           </w:p>
         </w:tc>
@@ -6105,7 +6163,7 @@
           </w:tcPr>
           <w:p>
             <w:r>
-              <w:t>Chính sách di chuyển giữa các giai đoạn</w:t>
+              <w:t>Mỗi sản phẩm/danh mục dùng pipeline phù hợp</w:t>
             </w:r>
           </w:p>
         </w:tc>
@@ -6151,7 +6209,7 @@
           </w:tcPr>
           <w:p>
             <w:r>
-              <w:t>Bộ pipeline mẫu sẵn</w:t>
+              <w:t>Đơn có nhiều sản phẩm khác pipeline — BA chọn pipeline</w:t>
             </w:r>
           </w:p>
         </w:tc>
@@ -6197,7 +6255,7 @@
           </w:tcPr>
           <w:p>
             <w:r>
-              <w:t>Sổ lịch sử pipeline duy nhất</w:t>
+              <w:t>Tự sao lưu phiên bản pipeline khi sửa lúc đang có đơn chạy</w:t>
             </w:r>
           </w:p>
         </w:tc>
@@ -6243,7 +6301,7 @@
           </w:tcPr>
           <w:p>
             <w:r>
-              <w:t>Trigger tự nhảy giai đoạn (giai đoạn 2)</w:t>
+              <w:t>Chính sách di chuyển giữa các giai đoạn</w:t>
             </w:r>
           </w:p>
         </w:tc>
@@ -6254,7 +6312,7 @@
           </w:tcPr>
           <w:p>
             <w:r>
-              <w:t>Giai đoạn 2</w:t>
+              <w:t>Giai đoạn 1</w:t>
             </w:r>
           </w:p>
         </w:tc>
@@ -6289,7 +6347,7 @@
           </w:tcPr>
           <w:p>
             <w:r>
-              <w:t>Tổng hợp tin nhắn khách 19 cửa hàng vào một chỗ</w:t>
+              <w:t>Bộ pipeline mẫu sẵn</w:t>
             </w:r>
           </w:p>
         </w:tc>
@@ -6300,7 +6358,7 @@
           </w:tcPr>
           <w:p>
             <w:r>
-              <w:t>Giai đoạn 2</w:t>
+              <w:t>Giai đoạn 1</w:t>
             </w:r>
           </w:p>
         </w:tc>
@@ -6335,7 +6393,7 @@
           </w:tcPr>
           <w:p>
             <w:r>
-              <w:t>Bảng kiểm soát giá (Pricing Audit) 25 cột</w:t>
+              <w:t>Sổ lịch sử pipeline duy nhất</w:t>
             </w:r>
           </w:p>
         </w:tc>
@@ -6346,7 +6404,7 @@
           </w:tcPr>
           <w:p>
             <w:r>
-              <w:t>Giai đoạn 2</w:t>
+              <w:t>Giai đoạn 1</w:t>
             </w:r>
           </w:p>
         </w:tc>
@@ -6381,7 +6439,7 @@
           </w:tcPr>
           <w:p>
             <w:r>
-              <w:t>Quy đổi giá đơn về EUR theo ngày đặt</w:t>
+              <w:t>Trigger tự nhảy giai đoạn (giai đoạn 2)</w:t>
             </w:r>
           </w:p>
         </w:tc>
@@ -6427,7 +6485,7 @@
           </w:tcPr>
           <w:p>
             <w:r>
-              <w:t>Tô màu chênh lệch giá so với catalog</w:t>
+              <w:t>Tổng hợp tin nhắn khách 19 cửa hàng vào một chỗ</w:t>
             </w:r>
           </w:p>
         </w:tc>
@@ -6473,7 +6531,7 @@
           </w:tcPr>
           <w:p>
             <w:r>
-              <w:t>Cảnh báo đơn lệch giá tự động hằng ngày</w:t>
+              <w:t>Bảng kiểm soát giá (Pricing Audit) 25 cột</w:t>
             </w:r>
           </w:p>
         </w:tc>
@@ -6519,7 +6577,7 @@
           </w:tcPr>
           <w:p>
             <w:r>
-              <w:t>Catalog Dashboard riêng cho từng sản phẩm</w:t>
+              <w:t>Quy đổi giá đơn về EUR theo ngày đặt</w:t>
             </w:r>
           </w:p>
         </w:tc>
@@ -6530,7 +6588,7 @@
           </w:tcPr>
           <w:p>
             <w:r>
-              <w:t>Giai đoạn 3</w:t>
+              <w:t>Giai đoạn 2</w:t>
             </w:r>
           </w:p>
         </w:tc>
@@ -6565,7 +6623,7 @@
           </w:tcPr>
           <w:p>
             <w:r>
-              <w:t>Lưu template + mockup ngay trên sản phẩm</w:t>
+              <w:t>Tô màu chênh lệch giá so với catalog</w:t>
             </w:r>
           </w:p>
         </w:tc>
@@ -6576,7 +6634,7 @@
           </w:tcPr>
           <w:p>
             <w:r>
-              <w:t>Giai đoạn 3</w:t>
+              <w:t>Giai đoạn 2</w:t>
             </w:r>
           </w:p>
         </w:tc>
@@ -6611,7 +6669,7 @@
           </w:tcPr>
           <w:p>
             <w:r>
-              <w:t>Trang scan barcode đơn giản cho PD</w:t>
+              <w:t>Cảnh báo đơn lệch giá tự động hằng ngày</w:t>
             </w:r>
           </w:p>
         </w:tc>
@@ -6622,7 +6680,7 @@
           </w:tcPr>
           <w:p>
             <w:r>
-              <w:t>Giai đoạn 3</w:t>
+              <w:t>Giai đoạn 2</w:t>
             </w:r>
           </w:p>
         </w:tc>
@@ -6657,7 +6715,7 @@
           </w:tcPr>
           <w:p>
             <w:r>
-              <w:t>Scan đồng bộ tất cả dashboard</w:t>
+              <w:t>Catalog Dashboard riêng cho từng sản phẩm</w:t>
             </w:r>
           </w:p>
         </w:tc>
@@ -6703,7 +6761,7 @@
           </w:tcPr>
           <w:p>
             <w:r>
-              <w:t>Tích hợp Amazon — đơn vào dashboard chung</w:t>
+              <w:t>Lưu template + mockup ngay trên sản phẩm</w:t>
             </w:r>
           </w:p>
         </w:tc>
@@ -6749,7 +6807,7 @@
           </w:tcPr>
           <w:p>
             <w:r>
-              <w:t>Mở Website Odoo và đưa đơn về dashboard chung</w:t>
+              <w:t>Trang scan barcode đơn giản cho PD</w:t>
             </w:r>
           </w:p>
         </w:tc>
@@ -6795,7 +6853,7 @@
           </w:tcPr>
           <w:p>
             <w:r>
-              <w:t>Hỗ trợ AI tổng hợp / trực quan hoá dữ liệu</w:t>
+              <w:t>Scan đồng bộ tất cả dashboard</w:t>
             </w:r>
           </w:p>
         </w:tc>
@@ -6841,7 +6899,7 @@
           </w:tcPr>
           <w:p>
             <w:r>
-              <w:t>Upload tồn kho nguyên liệu từ Excel</w:t>
+              <w:t>Tích hợp Amazon — đơn vào dashboard chung</w:t>
             </w:r>
           </w:p>
         </w:tc>
@@ -6887,7 +6945,7 @@
           </w:tcPr>
           <w:p>
             <w:r>
-              <w:t>Tự trừ nguyên liệu khi đơn đến giai đoạn cuối</w:t>
+              <w:t>Mở Website Odoo và đưa đơn về dashboard chung</w:t>
             </w:r>
           </w:p>
         </w:tc>
@@ -6933,7 +6991,7 @@
           </w:tcPr>
           <w:p>
             <w:r>
-              <w:t>Dự báo tồn kho 1 / 3 / 12 tháng</w:t>
+              <w:t>Hỗ trợ AI tổng hợp / trực quan hoá dữ liệu</w:t>
             </w:r>
           </w:p>
         </w:tc>
@@ -6969,6 +7027,144 @@
           <w:p>
             <w:r>
               <w:t>97</w:t>
+            </w:r>
+          </w:p>
+        </w:tc>
+        <w:tc>
+          <w:tcPr>
+            <w:tcW w:type="dxa" w:w="5386"/>
+            <w:vAlign w:val="top"/>
+          </w:tcPr>
+          <w:p>
+            <w:r>
+              <w:t>Upload tồn kho nguyên liệu từ Excel</w:t>
+            </w:r>
+          </w:p>
+        </w:tc>
+        <w:tc>
+          <w:tcPr>
+            <w:tcW w:type="dxa" w:w="1417"/>
+            <w:vAlign w:val="top"/>
+          </w:tcPr>
+          <w:p>
+            <w:r>
+              <w:t>Giai đoạn 3</w:t>
+            </w:r>
+          </w:p>
+        </w:tc>
+        <w:tc>
+          <w:tcPr>
+            <w:tcW w:type="dxa" w:w="1701"/>
+            <w:vAlign w:val="top"/>
+          </w:tcPr>
+          <w:p>
+            <w:r>
+              <w:t>Chưa bắt đầu</w:t>
+            </w:r>
+          </w:p>
+        </w:tc>
+      </w:tr>
+      <w:tr>
+        <w:tc>
+          <w:tcPr>
+            <w:tcW w:type="dxa" w:w="850"/>
+            <w:vAlign w:val="top"/>
+          </w:tcPr>
+          <w:p>
+            <w:r>
+              <w:t>98</w:t>
+            </w:r>
+          </w:p>
+        </w:tc>
+        <w:tc>
+          <w:tcPr>
+            <w:tcW w:type="dxa" w:w="5386"/>
+            <w:vAlign w:val="top"/>
+          </w:tcPr>
+          <w:p>
+            <w:r>
+              <w:t>Tự trừ nguyên liệu khi đơn đến giai đoạn cuối</w:t>
+            </w:r>
+          </w:p>
+        </w:tc>
+        <w:tc>
+          <w:tcPr>
+            <w:tcW w:type="dxa" w:w="1417"/>
+            <w:vAlign w:val="top"/>
+          </w:tcPr>
+          <w:p>
+            <w:r>
+              <w:t>Giai đoạn 3</w:t>
+            </w:r>
+          </w:p>
+        </w:tc>
+        <w:tc>
+          <w:tcPr>
+            <w:tcW w:type="dxa" w:w="1701"/>
+            <w:vAlign w:val="top"/>
+          </w:tcPr>
+          <w:p>
+            <w:r>
+              <w:t>Chưa bắt đầu</w:t>
+            </w:r>
+          </w:p>
+        </w:tc>
+      </w:tr>
+      <w:tr>
+        <w:tc>
+          <w:tcPr>
+            <w:tcW w:type="dxa" w:w="850"/>
+            <w:vAlign w:val="top"/>
+          </w:tcPr>
+          <w:p>
+            <w:r>
+              <w:t>99</w:t>
+            </w:r>
+          </w:p>
+        </w:tc>
+        <w:tc>
+          <w:tcPr>
+            <w:tcW w:type="dxa" w:w="5386"/>
+            <w:vAlign w:val="top"/>
+          </w:tcPr>
+          <w:p>
+            <w:r>
+              <w:t>Dự báo tồn kho 1 / 3 / 12 tháng</w:t>
+            </w:r>
+          </w:p>
+        </w:tc>
+        <w:tc>
+          <w:tcPr>
+            <w:tcW w:type="dxa" w:w="1417"/>
+            <w:vAlign w:val="top"/>
+          </w:tcPr>
+          <w:p>
+            <w:r>
+              <w:t>Giai đoạn 3</w:t>
+            </w:r>
+          </w:p>
+        </w:tc>
+        <w:tc>
+          <w:tcPr>
+            <w:tcW w:type="dxa" w:w="1701"/>
+            <w:vAlign w:val="top"/>
+          </w:tcPr>
+          <w:p>
+            <w:r>
+              <w:t>Chưa bắt đầu</w:t>
+            </w:r>
+          </w:p>
+        </w:tc>
+      </w:tr>
+      <w:tr>
+        <w:tc>
+          <w:tcPr>
+            <w:tcW w:type="dxa" w:w="850"/>
+            <w:vAlign w:val="top"/>
+          </w:tcPr>
+          <w:p>
+            <w:r>
+              <w:t>100</w:t>
             </w:r>
           </w:p>
         </w:tc>

</xml_diff>

<commit_message>
[mp006] docs: sync 100 owner items to JIRA (12 epics + 100 stories)
JIRA topology mirrors xlsx structure:
- 12 Epics (one per Nhóm hạng mục group): ESTY-7..ESTY-18
- 100 Stories (one per row, parent-linked to its group epic): ESTY-19..ESTY-118
- Status synced: 58 Hoàn thành -> JIRA Done, 42 Chưa bắt đầu -> JIRA To Do
- xlsx column J back-filled with all 100 story keys

New deliverables:
- jira_sync.py: idempotent sync helper (direct JIRA REST v3, sleep-throttled)
- epic_key_map.json: nhom -> epic key mapping (skips already-pushed on re-run)
- jira_keys.json: ten_ngan -> story key mapping (loaded by build_owner_docs)

Re-running jira_sync.py is safe: skips entries already in epic_key_map /
jira_keys / draft frontmatter.
</commit_message>
<xml_diff>
--- a/specs/006-master-plan/deliverables/SRS_He_Thong_Quan_Ly_Don_Hang_VN.docx
+++ b/specs/006-master-plan/deliverables/SRS_He_Thong_Quan_Ly_Don_Hang_VN.docx
@@ -2643,7 +2643,7 @@
           </w:tcPr>
           <w:p>
             <w:r>
-              <w:t>Chưa bắt đầu</w:t>
+              <w:t>Hoàn thành</w:t>
             </w:r>
           </w:p>
         </w:tc>
@@ -2689,7 +2689,7 @@
           </w:tcPr>
           <w:p>
             <w:r>
-              <w:t>Chưa bắt đầu</w:t>
+              <w:t>Hoàn thành</w:t>
             </w:r>
           </w:p>
         </w:tc>
@@ -2735,7 +2735,7 @@
           </w:tcPr>
           <w:p>
             <w:r>
-              <w:t>Chưa bắt đầu</w:t>
+              <w:t>Hoàn thành</w:t>
             </w:r>
           </w:p>
         </w:tc>
@@ -2781,7 +2781,7 @@
           </w:tcPr>
           <w:p>
             <w:r>
-              <w:t>Chưa bắt đầu</w:t>
+              <w:t>Hoàn thành</w:t>
             </w:r>
           </w:p>
         </w:tc>
@@ -2827,7 +2827,7 @@
           </w:tcPr>
           <w:p>
             <w:r>
-              <w:t>Chưa bắt đầu</w:t>
+              <w:t>Hoàn thành</w:t>
             </w:r>
           </w:p>
         </w:tc>
@@ -2873,7 +2873,7 @@
           </w:tcPr>
           <w:p>
             <w:r>
-              <w:t>Chưa bắt đầu</w:t>
+              <w:t>Hoàn thành</w:t>
             </w:r>
           </w:p>
         </w:tc>
@@ -2919,7 +2919,7 @@
           </w:tcPr>
           <w:p>
             <w:r>
-              <w:t>Chưa bắt đầu</w:t>
+              <w:t>Hoàn thành</w:t>
             </w:r>
           </w:p>
         </w:tc>
@@ -2965,7 +2965,7 @@
           </w:tcPr>
           <w:p>
             <w:r>
-              <w:t>Chưa bắt đầu</w:t>
+              <w:t>Hoàn thành</w:t>
             </w:r>
           </w:p>
         </w:tc>
@@ -3103,7 +3103,7 @@
           </w:tcPr>
           <w:p>
             <w:r>
-              <w:t>Chưa bắt đầu</w:t>
+              <w:t>Hoàn thành</w:t>
             </w:r>
           </w:p>
         </w:tc>
@@ -3149,7 +3149,7 @@
           </w:tcPr>
           <w:p>
             <w:r>
-              <w:t>Chưa bắt đầu</w:t>
+              <w:t>Hoàn thành</w:t>
             </w:r>
           </w:p>
         </w:tc>
@@ -3195,7 +3195,7 @@
           </w:tcPr>
           <w:p>
             <w:r>
-              <w:t>Chưa bắt đầu</w:t>
+              <w:t>Hoàn thành</w:t>
             </w:r>
           </w:p>
         </w:tc>
@@ -3241,7 +3241,7 @@
           </w:tcPr>
           <w:p>
             <w:r>
-              <w:t>Chưa bắt đầu</w:t>
+              <w:t>Hoàn thành</w:t>
             </w:r>
           </w:p>
         </w:tc>
@@ -3287,7 +3287,7 @@
           </w:tcPr>
           <w:p>
             <w:r>
-              <w:t>Chưa bắt đầu</w:t>
+              <w:t>Hoàn thành</w:t>
             </w:r>
           </w:p>
         </w:tc>
@@ -3333,7 +3333,7 @@
           </w:tcPr>
           <w:p>
             <w:r>
-              <w:t>Chưa bắt đầu</w:t>
+              <w:t>Hoàn thành</w:t>
             </w:r>
           </w:p>
         </w:tc>
@@ -3379,7 +3379,7 @@
           </w:tcPr>
           <w:p>
             <w:r>
-              <w:t>Chưa bắt đầu</w:t>
+              <w:t>Hoàn thành</w:t>
             </w:r>
           </w:p>
         </w:tc>
@@ -3425,7 +3425,7 @@
           </w:tcPr>
           <w:p>
             <w:r>
-              <w:t>Chưa bắt đầu</w:t>
+              <w:t>Hoàn thành</w:t>
             </w:r>
           </w:p>
         </w:tc>
@@ -3471,7 +3471,7 @@
           </w:tcPr>
           <w:p>
             <w:r>
-              <w:t>Chưa bắt đầu</w:t>
+              <w:t>Hoàn thành</w:t>
             </w:r>
           </w:p>
         </w:tc>
@@ -3517,7 +3517,7 @@
           </w:tcPr>
           <w:p>
             <w:r>
-              <w:t>Chưa bắt đầu</w:t>
+              <w:t>Hoàn thành</w:t>
             </w:r>
           </w:p>
         </w:tc>
@@ -3563,7 +3563,7 @@
           </w:tcPr>
           <w:p>
             <w:r>
-              <w:t>Chưa bắt đầu</w:t>
+              <w:t>Hoàn thành</w:t>
             </w:r>
           </w:p>
         </w:tc>
@@ -3609,7 +3609,7 @@
           </w:tcPr>
           <w:p>
             <w:r>
-              <w:t>Chưa bắt đầu</w:t>
+              <w:t>Hoàn thành</w:t>
             </w:r>
           </w:p>
         </w:tc>
@@ -3655,7 +3655,7 @@
           </w:tcPr>
           <w:p>
             <w:r>
-              <w:t>Chưa bắt đầu</w:t>
+              <w:t>Hoàn thành</w:t>
             </w:r>
           </w:p>
         </w:tc>
@@ -3701,7 +3701,7 @@
           </w:tcPr>
           <w:p>
             <w:r>
-              <w:t>Chưa bắt đầu</w:t>
+              <w:t>Hoàn thành</w:t>
             </w:r>
           </w:p>
         </w:tc>
@@ -3747,7 +3747,7 @@
           </w:tcPr>
           <w:p>
             <w:r>
-              <w:t>Chưa bắt đầu</w:t>
+              <w:t>Hoàn thành</w:t>
             </w:r>
           </w:p>
         </w:tc>
@@ -3793,7 +3793,7 @@
           </w:tcPr>
           <w:p>
             <w:r>
-              <w:t>Chưa bắt đầu</w:t>
+              <w:t>Hoàn thành</w:t>
             </w:r>
           </w:p>
         </w:tc>
@@ -3839,7 +3839,7 @@
           </w:tcPr>
           <w:p>
             <w:r>
-              <w:t>Chưa bắt đầu</w:t>
+              <w:t>Hoàn thành</w:t>
             </w:r>
           </w:p>
         </w:tc>
@@ -3885,7 +3885,7 @@
           </w:tcPr>
           <w:p>
             <w:r>
-              <w:t>Chưa bắt đầu</w:t>
+              <w:t>Hoàn thành</w:t>
             </w:r>
           </w:p>
         </w:tc>
@@ -3931,7 +3931,7 @@
           </w:tcPr>
           <w:p>
             <w:r>
-              <w:t>Chưa bắt đầu</w:t>
+              <w:t>Hoàn thành</w:t>
             </w:r>
           </w:p>
         </w:tc>
@@ -3977,7 +3977,7 @@
           </w:tcPr>
           <w:p>
             <w:r>
-              <w:t>Chưa bắt đầu</w:t>
+              <w:t>Hoàn thành</w:t>
             </w:r>
           </w:p>
         </w:tc>
@@ -4023,7 +4023,7 @@
           </w:tcPr>
           <w:p>
             <w:r>
-              <w:t>Chưa bắt đầu</w:t>
+              <w:t>Hoàn thành</w:t>
             </w:r>
           </w:p>
         </w:tc>
@@ -4069,7 +4069,7 @@
           </w:tcPr>
           <w:p>
             <w:r>
-              <w:t>Chưa bắt đầu</w:t>
+              <w:t>Hoàn thành</w:t>
             </w:r>
           </w:p>
         </w:tc>
@@ -4115,7 +4115,7 @@
           </w:tcPr>
           <w:p>
             <w:r>
-              <w:t>Chưa bắt đầu</w:t>
+              <w:t>Hoàn thành</w:t>
             </w:r>
           </w:p>
         </w:tc>
@@ -4207,7 +4207,7 @@
           </w:tcPr>
           <w:p>
             <w:r>
-              <w:t>Chưa bắt đầu</w:t>
+              <w:t>Hoàn thành</w:t>
             </w:r>
           </w:p>
         </w:tc>
@@ -4253,7 +4253,7 @@
           </w:tcPr>
           <w:p>
             <w:r>
-              <w:t>Chưa bắt đầu</w:t>
+              <w:t>Hoàn thành</w:t>
             </w:r>
           </w:p>
         </w:tc>
@@ -4299,7 +4299,7 @@
           </w:tcPr>
           <w:p>
             <w:r>
-              <w:t>Chưa bắt đầu</w:t>
+              <w:t>Hoàn thành</w:t>
             </w:r>
           </w:p>
         </w:tc>
@@ -4345,7 +4345,7 @@
           </w:tcPr>
           <w:p>
             <w:r>
-              <w:t>Chưa bắt đầu</w:t>
+              <w:t>Hoàn thành</w:t>
             </w:r>
           </w:p>
         </w:tc>
@@ -4391,7 +4391,7 @@
           </w:tcPr>
           <w:p>
             <w:r>
-              <w:t>Chưa bắt đầu</w:t>
+              <w:t>Hoàn thành</w:t>
             </w:r>
           </w:p>
         </w:tc>
@@ -4437,7 +4437,7 @@
           </w:tcPr>
           <w:p>
             <w:r>
-              <w:t>Chưa bắt đầu</w:t>
+              <w:t>Hoàn thành</w:t>
             </w:r>
           </w:p>
         </w:tc>
@@ -4483,7 +4483,7 @@
           </w:tcPr>
           <w:p>
             <w:r>
-              <w:t>Chưa bắt đầu</w:t>
+              <w:t>Hoàn thành</w:t>
             </w:r>
           </w:p>
         </w:tc>
@@ -4805,7 +4805,7 @@
           </w:tcPr>
           <w:p>
             <w:r>
-              <w:t>Chưa bắt đầu</w:t>
+              <w:t>Hoàn thành</w:t>
             </w:r>
           </w:p>
         </w:tc>
@@ -4943,7 +4943,7 @@
           </w:tcPr>
           <w:p>
             <w:r>
-              <w:t>Chưa bắt đầu</w:t>
+              <w:t>Hoàn thành</w:t>
             </w:r>
           </w:p>
         </w:tc>
@@ -5035,7 +5035,7 @@
           </w:tcPr>
           <w:p>
             <w:r>
-              <w:t>Chưa bắt đầu</w:t>
+              <w:t>Hoàn thành</w:t>
             </w:r>
           </w:p>
         </w:tc>
@@ -5081,7 +5081,7 @@
           </w:tcPr>
           <w:p>
             <w:r>
-              <w:t>Chưa bắt đầu</w:t>
+              <w:t>Hoàn thành</w:t>
             </w:r>
           </w:p>
         </w:tc>
@@ -5127,7 +5127,7 @@
           </w:tcPr>
           <w:p>
             <w:r>
-              <w:t>Chưa bắt đầu</w:t>
+              <w:t>Hoàn thành</w:t>
             </w:r>
           </w:p>
         </w:tc>
@@ -5173,7 +5173,7 @@
           </w:tcPr>
           <w:p>
             <w:r>
-              <w:t>Chưa bắt đầu</w:t>
+              <w:t>Hoàn thành</w:t>
             </w:r>
           </w:p>
         </w:tc>
@@ -5403,7 +5403,7 @@
           </w:tcPr>
           <w:p>
             <w:r>
-              <w:t>Chưa bắt đầu</w:t>
+              <w:t>Hoàn thành</w:t>
             </w:r>
           </w:p>
         </w:tc>
@@ -5449,7 +5449,7 @@
           </w:tcPr>
           <w:p>
             <w:r>
-              <w:t>Chưa bắt đầu</w:t>
+              <w:t>Hoàn thành</w:t>
             </w:r>
           </w:p>
         </w:tc>
@@ -5495,7 +5495,7 @@
           </w:tcPr>
           <w:p>
             <w:r>
-              <w:t>Chưa bắt đầu</w:t>
+              <w:t>Hoàn thành</w:t>
             </w:r>
           </w:p>
         </w:tc>
@@ -5541,7 +5541,7 @@
           </w:tcPr>
           <w:p>
             <w:r>
-              <w:t>Chưa bắt đầu</w:t>
+              <w:t>Hoàn thành</w:t>
             </w:r>
           </w:p>
         </w:tc>
@@ -5817,7 +5817,7 @@
           </w:tcPr>
           <w:p>
             <w:r>
-              <w:t>Chưa bắt đầu</w:t>
+              <w:t>Hoàn thành</w:t>
             </w:r>
           </w:p>
         </w:tc>
@@ -5863,7 +5863,7 @@
           </w:tcPr>
           <w:p>
             <w:r>
-              <w:t>Chưa bắt đầu</w:t>
+              <w:t>Hoàn thành</w:t>
             </w:r>
           </w:p>
         </w:tc>
@@ -5909,7 +5909,7 @@
           </w:tcPr>
           <w:p>
             <w:r>
-              <w:t>Chưa bắt đầu</w:t>
+              <w:t>Hoàn thành</w:t>
             </w:r>
           </w:p>
         </w:tc>
@@ -5955,7 +5955,7 @@
           </w:tcPr>
           <w:p>
             <w:r>
-              <w:t>Chưa bắt đầu</w:t>
+              <w:t>Hoàn thành</w:t>
             </w:r>
           </w:p>
         </w:tc>
@@ -6139,7 +6139,7 @@
           </w:tcPr>
           <w:p>
             <w:r>
-              <w:t>Chưa bắt đầu</w:t>
+              <w:t>Hoàn thành</w:t>
             </w:r>
           </w:p>
         </w:tc>
@@ -6185,7 +6185,7 @@
           </w:tcPr>
           <w:p>
             <w:r>
-              <w:t>Chưa bắt đầu</w:t>
+              <w:t>Hoàn thành</w:t>
             </w:r>
           </w:p>
         </w:tc>
@@ -6231,7 +6231,7 @@
           </w:tcPr>
           <w:p>
             <w:r>
-              <w:t>Chưa bắt đầu</w:t>
+              <w:t>Hoàn thành</w:t>
             </w:r>
           </w:p>
         </w:tc>
@@ -6277,7 +6277,7 @@
           </w:tcPr>
           <w:p>
             <w:r>
-              <w:t>Chưa bắt đầu</w:t>
+              <w:t>Hoàn thành</w:t>
             </w:r>
           </w:p>
         </w:tc>
@@ -6323,7 +6323,7 @@
           </w:tcPr>
           <w:p>
             <w:r>
-              <w:t>Chưa bắt đầu</w:t>
+              <w:t>Hoàn thành</w:t>
             </w:r>
           </w:p>
         </w:tc>
@@ -6369,7 +6369,7 @@
           </w:tcPr>
           <w:p>
             <w:r>
-              <w:t>Chưa bắt đầu</w:t>
+              <w:t>Hoàn thành</w:t>
             </w:r>
           </w:p>
         </w:tc>

</xml_diff>